<commit_message>
Added The Latex file
</commit_message>
<xml_diff>
--- a/docs/03_3MT/3_MT_Transcript_Elias_Yoonie_Hoon.docx
+++ b/docs/03_3MT/3_MT_Transcript_Elias_Yoonie_Hoon.docx
@@ -1,6 +1,6 @@
 
 <file path=word/document.xml><?xml version="1.0" encoding="utf-8"?>
-<w:document xmlns:wpc="http://schemas.microsoft.com/office/word/2010/wordprocessingCanvas" xmlns:mc="http://schemas.openxmlformats.org/markup-compatibility/2006" xmlns:o="urn:schemas-microsoft-com:office:office" xmlns:r="http://schemas.openxmlformats.org/officeDocument/2006/relationships" xmlns:m="http://schemas.openxmlformats.org/officeDocument/2006/math" xmlns:v="urn:schemas-microsoft-com:vml" xmlns:wp14="http://schemas.microsoft.com/office/word/2010/wordprocessingDrawing" xmlns:wp="http://schemas.openxmlformats.org/drawingml/2006/wordprocessingDrawing" xmlns:w10="urn:schemas-microsoft-com:office:word" xmlns:w="http://schemas.openxmlformats.org/wordprocessingml/2006/main" xmlns:w14="http://schemas.microsoft.com/office/word/2010/wordml" xmlns:w15="http://schemas.microsoft.com/office/word/2012/wordml" xmlns:wpg="http://schemas.microsoft.com/office/word/2010/wordprocessingGroup" xmlns:wpi="http://schemas.microsoft.com/office/word/2010/wordprocessingInk" xmlns:wne="http://schemas.microsoft.com/office/word/2006/wordml" xmlns:wps="http://schemas.microsoft.com/office/word/2010/wordprocessingShape" mc:Ignorable="w14 w15 wp14">
+<w:document xmlns:wpc="http://schemas.microsoft.com/office/word/2010/wordprocessingCanvas" xmlns:cx="http://schemas.microsoft.com/office/drawing/2014/chartex" xmlns:cx1="http://schemas.microsoft.com/office/drawing/2015/9/8/chartex" xmlns:cx2="http://schemas.microsoft.com/office/drawing/2015/10/21/chartex" xmlns:cx3="http://schemas.microsoft.com/office/drawing/2016/5/9/chartex" xmlns:cx4="http://schemas.microsoft.com/office/drawing/2016/5/10/chartex" xmlns:cx5="http://schemas.microsoft.com/office/drawing/2016/5/11/chartex" xmlns:cx6="http://schemas.microsoft.com/office/drawing/2016/5/12/chartex" xmlns:cx7="http://schemas.microsoft.com/office/drawing/2016/5/13/chartex" xmlns:cx8="http://schemas.microsoft.com/office/drawing/2016/5/14/chartex" xmlns:mc="http://schemas.openxmlformats.org/markup-compatibility/2006" xmlns:aink="http://schemas.microsoft.com/office/drawing/2016/ink" xmlns:am3d="http://schemas.microsoft.com/office/drawing/2017/model3d" xmlns:o="urn:schemas-microsoft-com:office:office" xmlns:oel="http://schemas.microsoft.com/office/2019/extlst" xmlns:r="http://schemas.openxmlformats.org/officeDocument/2006/relationships" xmlns:m="http://schemas.openxmlformats.org/officeDocument/2006/math" xmlns:v="urn:schemas-microsoft-com:vml" xmlns:wp14="http://schemas.microsoft.com/office/word/2010/wordprocessingDrawing" xmlns:wp="http://schemas.openxmlformats.org/drawingml/2006/wordprocessingDrawing" xmlns:w10="urn:schemas-microsoft-com:office:word" xmlns:w="http://schemas.openxmlformats.org/wordprocessingml/2006/main" xmlns:w14="http://schemas.microsoft.com/office/word/2010/wordml" xmlns:w15="http://schemas.microsoft.com/office/word/2012/wordml" xmlns:w16cex="http://schemas.microsoft.com/office/word/2018/wordml/cex" xmlns:w16cid="http://schemas.microsoft.com/office/word/2016/wordml/cid" xmlns:w16="http://schemas.microsoft.com/office/word/2018/wordml" xmlns:w16du="http://schemas.microsoft.com/office/word/2023/wordml/word16du" xmlns:w16sdtdh="http://schemas.microsoft.com/office/word/2020/wordml/sdtdatahash" xmlns:w16sdtfl="http://schemas.microsoft.com/office/word/2024/wordml/sdtformatlock" xmlns:w16se="http://schemas.microsoft.com/office/word/2015/wordml/symex" xmlns:wpg="http://schemas.microsoft.com/office/word/2010/wordprocessingGroup" xmlns:wpi="http://schemas.microsoft.com/office/word/2010/wordprocessingInk" xmlns:wne="http://schemas.microsoft.com/office/word/2006/wordml" xmlns:wps="http://schemas.microsoft.com/office/word/2010/wordprocessingShape" mc:Ignorable="w14 w15 w16se w16cid w16 w16cex w16sdtdh w16sdtfl w16du wp14">
   <w:body>
     <w:p>
       <w:r>
@@ -57,7 +57,7 @@
     </w:p>
     <w:p>
       <w:r>
-        <w:t>First, adapter compatibility. If a car's plug doesn't match the charger, the driver needs an adapter or another station. None of the six models shows which adapters work with which plugs. And even the same plug can have different names across systems. So, how can drivers know which adapter they need?</w:t>
+        <w:t>First, adapter compatibility. In North America, many connector types are used together, so if a car does not match the plug, the driver has to go to another station or buy an adapter. None of the six models shows which adapters work with which plugs. And as you can see here, even the same plug can have different names across systems. So, how can drivers know which adapter they need?</w:t>
       </w:r>
     </w:p>
     <w:p>
@@ -67,12 +67,12 @@
     </w:p>
     <w:p>
       <w:r>
-        <w:t>Even operating hours and other details are often stored as plain text, making them hard to use in queries.</w:t>
-      </w:r>
-    </w:p>
-    <w:p>
-      <w:r>
-        <w:t>So, we have the information, but it's not connected well enough to answer one simple question:</w:t>
+        <w:t>Even opening hours are often stored as plain text, making them hard for computers to check.</w:t>
+      </w:r>
+    </w:p>
+    <w:p>
+      <w:r>
+        <w:t>So, the information exists, but it's not connected well enough to answer one question:</w:t>
       </w:r>
     </w:p>
     <w:p>
@@ -86,76 +86,41 @@
     </w:p>
     <w:p>
       <w:r>
-        <w:t>"</w:t>
-      </w:r>
-      <w:r>
-        <w:t>Can my vehicle actually charge here?</w:t>
-      </w:r>
-      <w:r>
-        <w:t>" To answer it, we check four things.</w:t>
-      </w:r>
-    </w:p>
-    <w:p>
-      <w:r>
-        <w:t>First,</w:t>
-      </w:r>
-      <w:r>
-        <w:t xml:space="preserve"> Is it open? Operating hours are stored as structured periods, not free text.</w:t>
-      </w:r>
-    </w:p>
-    <w:p>
-      <w:r>
-        <w:t xml:space="preserve">Second, </w:t>
-      </w:r>
+        <w:t>"Can this vehicle, driven by this driver, charge at this station if it arrives now?" To answer it, we check four things.</w:t>
+      </w:r>
+    </w:p>
+    <w:p>
+      <w:r>
+        <w:t>Is it open? Operating hours are stored as structured periods, not free text.</w:t>
+      </w:r>
+    </w:p>
+    <w:p>
       <w:r>
         <w:t>Can the vehicle enter? We check who is allowed to use the station, and match its maximum vehicle class with the vehicle’s class.</w:t>
       </w:r>
     </w:p>
     <w:p>
       <w:r>
-        <w:t xml:space="preserve">Third, </w:t>
-      </w:r>
-      <w:r>
         <w:t>Does the plug fit? The Adapter entity links one connector type to another, so a car can still charge even if its plug does not match through an adapter.</w:t>
       </w:r>
     </w:p>
     <w:p>
       <w:r>
-        <w:t xml:space="preserve">Lastly, </w:t>
-      </w:r>
-      <w:r>
+        <w:lastRenderedPageBreak/>
         <w:t>Can the driver pay? Driver is linked to Network through membership.</w:t>
       </w:r>
     </w:p>
     <w:p>
       <w:r>
-        <w:lastRenderedPageBreak/>
-        <w:t>PluggedIn is a data model built around the driver, not the station.</w:t>
-      </w:r>
-      <w:r>
-        <w:t xml:space="preserve"> Also e</w:t>
-      </w:r>
-      <w:r>
-        <w:t>very relationship is named as a verb, so the model can easily become a knowledge graph. That is</w:t>
-      </w:r>
-      <w:r>
-        <w:t xml:space="preserve"> our solution,</w:t>
-      </w:r>
-      <w:r>
-        <w:t xml:space="preserve"> PluggedIn. Thank you.</w:t>
-      </w:r>
-    </w:p>
-    <w:p>
-      <w:pPr>
-        <w:rPr>
-          <w:rFonts w:eastAsia="SimSun" w:hint="eastAsia"/>
-        </w:rPr>
-      </w:pPr>
-    </w:p>
-    <w:p>
-      <w:bookmarkStart w:id="0" w:name="_GoBack"/>
-      <w:bookmarkEnd w:id="0"/>
-    </w:p>
+        <w:t>Every relationship is named as a verb, so the model can easily become a knowledge graph. That is PluggedIn. Thank you.</w:t>
+      </w:r>
+    </w:p>
+    <w:p>
+      <w:r>
+        <w:t> </w:t>
+      </w:r>
+    </w:p>
+    <w:p/>
     <w:sectPr>
       <w:pgSz w:w="11906" w:h="16838"/>
       <w:pgMar w:top="1440" w:right="1440" w:bottom="1440" w:left="1440" w:header="708" w:footer="708" w:gutter="0"/>
@@ -166,58 +131,8 @@
 </w:document>
 </file>
 
-<file path=word/endnotes.xml><?xml version="1.0" encoding="utf-8"?>
-<w:endnotes xmlns:wpc="http://schemas.microsoft.com/office/word/2010/wordprocessingCanvas" xmlns:mc="http://schemas.openxmlformats.org/markup-compatibility/2006" xmlns:o="urn:schemas-microsoft-com:office:office" xmlns:r="http://schemas.openxmlformats.org/officeDocument/2006/relationships" xmlns:m="http://schemas.openxmlformats.org/officeDocument/2006/math" xmlns:v="urn:schemas-microsoft-com:vml" xmlns:wp14="http://schemas.microsoft.com/office/word/2010/wordprocessingDrawing" xmlns:wp="http://schemas.openxmlformats.org/drawingml/2006/wordprocessingDrawing" xmlns:w10="urn:schemas-microsoft-com:office:word" xmlns:w="http://schemas.openxmlformats.org/wordprocessingml/2006/main" xmlns:w14="http://schemas.microsoft.com/office/word/2010/wordml" xmlns:w15="http://schemas.microsoft.com/office/word/2012/wordml" xmlns:wpg="http://schemas.microsoft.com/office/word/2010/wordprocessingGroup" xmlns:wpi="http://schemas.microsoft.com/office/word/2010/wordprocessingInk" xmlns:wne="http://schemas.microsoft.com/office/word/2006/wordml" xmlns:wps="http://schemas.microsoft.com/office/word/2010/wordprocessingShape" mc:Ignorable="w14 w15 wp14">
-  <w:endnote w:type="separator" w:id="-1">
-    <w:p>
-      <w:pPr>
-        <w:spacing w:after="0" w:line="240" w:lineRule="auto"/>
-      </w:pPr>
-      <w:r>
-        <w:separator/>
-      </w:r>
-    </w:p>
-  </w:endnote>
-  <w:endnote w:type="continuationSeparator" w:id="0">
-    <w:p>
-      <w:pPr>
-        <w:spacing w:after="0" w:line="240" w:lineRule="auto"/>
-      </w:pPr>
-      <w:r>
-        <w:continuationSeparator/>
-      </w:r>
-    </w:p>
-  </w:endnote>
-</w:endnotes>
-</file>
-
-<file path=word/footnotes.xml><?xml version="1.0" encoding="utf-8"?>
-<w:footnotes xmlns:wpc="http://schemas.microsoft.com/office/word/2010/wordprocessingCanvas" xmlns:mc="http://schemas.openxmlformats.org/markup-compatibility/2006" xmlns:o="urn:schemas-microsoft-com:office:office" xmlns:r="http://schemas.openxmlformats.org/officeDocument/2006/relationships" xmlns:m="http://schemas.openxmlformats.org/officeDocument/2006/math" xmlns:v="urn:schemas-microsoft-com:vml" xmlns:wp14="http://schemas.microsoft.com/office/word/2010/wordprocessingDrawing" xmlns:wp="http://schemas.openxmlformats.org/drawingml/2006/wordprocessingDrawing" xmlns:w10="urn:schemas-microsoft-com:office:word" xmlns:w="http://schemas.openxmlformats.org/wordprocessingml/2006/main" xmlns:w14="http://schemas.microsoft.com/office/word/2010/wordml" xmlns:w15="http://schemas.microsoft.com/office/word/2012/wordml" xmlns:wpg="http://schemas.microsoft.com/office/word/2010/wordprocessingGroup" xmlns:wpi="http://schemas.microsoft.com/office/word/2010/wordprocessingInk" xmlns:wne="http://schemas.microsoft.com/office/word/2006/wordml" xmlns:wps="http://schemas.microsoft.com/office/word/2010/wordprocessingShape" mc:Ignorable="w14 w15 wp14">
-  <w:footnote w:type="separator" w:id="-1">
-    <w:p>
-      <w:pPr>
-        <w:spacing w:after="0" w:line="240" w:lineRule="auto"/>
-      </w:pPr>
-      <w:r>
-        <w:separator/>
-      </w:r>
-    </w:p>
-  </w:footnote>
-  <w:footnote w:type="continuationSeparator" w:id="0">
-    <w:p>
-      <w:pPr>
-        <w:spacing w:after="0" w:line="240" w:lineRule="auto"/>
-      </w:pPr>
-      <w:r>
-        <w:continuationSeparator/>
-      </w:r>
-    </w:p>
-  </w:footnote>
-</w:footnotes>
-</file>
-
 <file path=word/styles.xml><?xml version="1.0" encoding="utf-8"?>
-<w:styles xmlns:mc="http://schemas.openxmlformats.org/markup-compatibility/2006" xmlns:r="http://schemas.openxmlformats.org/officeDocument/2006/relationships" xmlns:w="http://schemas.openxmlformats.org/wordprocessingml/2006/main" xmlns:w14="http://schemas.microsoft.com/office/word/2010/wordml" xmlns:w15="http://schemas.microsoft.com/office/word/2012/wordml" mc:Ignorable="w14 w15">
+<w:styles xmlns:mc="http://schemas.openxmlformats.org/markup-compatibility/2006" xmlns:r="http://schemas.openxmlformats.org/officeDocument/2006/relationships" xmlns:w="http://schemas.openxmlformats.org/wordprocessingml/2006/main" xmlns:w14="http://schemas.microsoft.com/office/word/2010/wordml" xmlns:w15="http://schemas.microsoft.com/office/word/2012/wordml" xmlns:w16cex="http://schemas.microsoft.com/office/word/2018/wordml/cex" xmlns:w16cid="http://schemas.microsoft.com/office/word/2016/wordml/cid" xmlns:w16="http://schemas.microsoft.com/office/word/2018/wordml" xmlns:w16du="http://schemas.microsoft.com/office/word/2023/wordml/word16du" xmlns:w16sdtdh="http://schemas.microsoft.com/office/word/2020/wordml/sdtdatahash" xmlns:w16sdtfl="http://schemas.microsoft.com/office/word/2024/wordml/sdtformatlock" xmlns:w16se="http://schemas.microsoft.com/office/word/2015/wordml/symex" mc:Ignorable="w14 w15 w16se w16cid w16 w16cex w16sdtdh w16sdtfl w16du">
   <w:docDefaults>
     <w:rPrDefault>
       <w:rPr>
@@ -235,7 +150,7 @@
       </w:pPr>
     </w:pPrDefault>
   </w:docDefaults>
-  <w:latentStyles w:defLockedState="0" w:defUIPriority="99" w:defSemiHidden="0" w:defUnhideWhenUsed="0" w:defQFormat="0" w:count="371">
+  <w:latentStyles w:defLockedState="0" w:defUIPriority="99" w:defSemiHidden="0" w:defUnhideWhenUsed="0" w:defQFormat="0" w:count="376">
     <w:lsdException w:name="Normal" w:uiPriority="0" w:qFormat="1"/>
     <w:lsdException w:name="heading 1" w:uiPriority="9" w:qFormat="1"/>
     <w:lsdException w:name="heading 2" w:semiHidden="1" w:uiPriority="9" w:unhideWhenUsed="1" w:qFormat="1"/>
@@ -607,16 +522,21 @@
     <w:lsdException w:name="List Table 5 Dark Accent 6" w:uiPriority="50"/>
     <w:lsdException w:name="List Table 6 Colorful Accent 6" w:uiPriority="51"/>
     <w:lsdException w:name="List Table 7 Colorful Accent 6" w:uiPriority="52"/>
+    <w:lsdException w:name="Mention" w:semiHidden="1" w:unhideWhenUsed="1"/>
+    <w:lsdException w:name="Smart Hyperlink" w:semiHidden="1" w:unhideWhenUsed="1"/>
+    <w:lsdException w:name="Hashtag" w:semiHidden="1" w:unhideWhenUsed="1"/>
+    <w:lsdException w:name="Unresolved Mention" w:semiHidden="1" w:unhideWhenUsed="1"/>
+    <w:lsdException w:name="Smart Link" w:semiHidden="1" w:unhideWhenUsed="1"/>
   </w:latentStyles>
-  <w:style w:type="paragraph" w:default="1" w:styleId="a">
+  <w:style w:type="paragraph" w:default="1" w:styleId="Standard">
     <w:name w:val="Normal"/>
     <w:qFormat/>
   </w:style>
-  <w:style w:type="paragraph" w:styleId="1">
+  <w:style w:type="paragraph" w:styleId="berschrift1">
     <w:name w:val="heading 1"/>
-    <w:basedOn w:val="a"/>
-    <w:next w:val="a"/>
-    <w:link w:val="1Char"/>
+    <w:basedOn w:val="Standard"/>
+    <w:next w:val="Standard"/>
+    <w:link w:val="berschrift1Zchn"/>
     <w:uiPriority w:val="9"/>
     <w:qFormat/>
     <w:rsid w:val="008E5513"/>
@@ -633,11 +553,11 @@
       <w:szCs w:val="40"/>
     </w:rPr>
   </w:style>
-  <w:style w:type="paragraph" w:styleId="2">
+  <w:style w:type="paragraph" w:styleId="berschrift2">
     <w:name w:val="heading 2"/>
-    <w:basedOn w:val="a"/>
-    <w:next w:val="a"/>
-    <w:link w:val="2Char"/>
+    <w:basedOn w:val="Standard"/>
+    <w:next w:val="Standard"/>
+    <w:link w:val="berschrift2Zchn"/>
     <w:uiPriority w:val="9"/>
     <w:semiHidden/>
     <w:unhideWhenUsed/>
@@ -656,11 +576,11 @@
       <w:szCs w:val="32"/>
     </w:rPr>
   </w:style>
-  <w:style w:type="paragraph" w:styleId="3">
+  <w:style w:type="paragraph" w:styleId="berschrift3">
     <w:name w:val="heading 3"/>
-    <w:basedOn w:val="a"/>
-    <w:next w:val="a"/>
-    <w:link w:val="3Char"/>
+    <w:basedOn w:val="Standard"/>
+    <w:next w:val="Standard"/>
+    <w:link w:val="berschrift3Zchn"/>
     <w:uiPriority w:val="9"/>
     <w:semiHidden/>
     <w:unhideWhenUsed/>
@@ -679,11 +599,11 @@
       <w:szCs w:val="28"/>
     </w:rPr>
   </w:style>
-  <w:style w:type="paragraph" w:styleId="4">
+  <w:style w:type="paragraph" w:styleId="berschrift4">
     <w:name w:val="heading 4"/>
-    <w:basedOn w:val="a"/>
-    <w:next w:val="a"/>
-    <w:link w:val="4Char"/>
+    <w:basedOn w:val="Standard"/>
+    <w:next w:val="Standard"/>
+    <w:link w:val="berschrift4Zchn"/>
     <w:uiPriority w:val="9"/>
     <w:semiHidden/>
     <w:unhideWhenUsed/>
@@ -702,11 +622,11 @@
       <w:color w:val="0F4761" w:themeColor="accent1" w:themeShade="BF"/>
     </w:rPr>
   </w:style>
-  <w:style w:type="paragraph" w:styleId="5">
+  <w:style w:type="paragraph" w:styleId="berschrift5">
     <w:name w:val="heading 5"/>
-    <w:basedOn w:val="a"/>
-    <w:next w:val="a"/>
-    <w:link w:val="5Char"/>
+    <w:basedOn w:val="Standard"/>
+    <w:next w:val="Standard"/>
+    <w:link w:val="berschrift5Zchn"/>
     <w:uiPriority w:val="9"/>
     <w:semiHidden/>
     <w:unhideWhenUsed/>
@@ -723,11 +643,11 @@
       <w:color w:val="0F4761" w:themeColor="accent1" w:themeShade="BF"/>
     </w:rPr>
   </w:style>
-  <w:style w:type="paragraph" w:styleId="6">
+  <w:style w:type="paragraph" w:styleId="berschrift6">
     <w:name w:val="heading 6"/>
-    <w:basedOn w:val="a"/>
-    <w:next w:val="a"/>
-    <w:link w:val="6Char"/>
+    <w:basedOn w:val="Standard"/>
+    <w:next w:val="Standard"/>
+    <w:link w:val="berschrift6Zchn"/>
     <w:uiPriority w:val="9"/>
     <w:semiHidden/>
     <w:unhideWhenUsed/>
@@ -746,11 +666,11 @@
       <w:color w:val="595959" w:themeColor="text1" w:themeTint="A6"/>
     </w:rPr>
   </w:style>
-  <w:style w:type="paragraph" w:styleId="7">
+  <w:style w:type="paragraph" w:styleId="berschrift7">
     <w:name w:val="heading 7"/>
-    <w:basedOn w:val="a"/>
-    <w:next w:val="a"/>
-    <w:link w:val="7Char"/>
+    <w:basedOn w:val="Standard"/>
+    <w:next w:val="Standard"/>
+    <w:link w:val="berschrift7Zchn"/>
     <w:uiPriority w:val="9"/>
     <w:semiHidden/>
     <w:unhideWhenUsed/>
@@ -767,11 +687,11 @@
       <w:color w:val="595959" w:themeColor="text1" w:themeTint="A6"/>
     </w:rPr>
   </w:style>
-  <w:style w:type="paragraph" w:styleId="8">
+  <w:style w:type="paragraph" w:styleId="berschrift8">
     <w:name w:val="heading 8"/>
-    <w:basedOn w:val="a"/>
-    <w:next w:val="a"/>
-    <w:link w:val="8Char"/>
+    <w:basedOn w:val="Standard"/>
+    <w:next w:val="Standard"/>
+    <w:link w:val="berschrift8Zchn"/>
     <w:uiPriority w:val="9"/>
     <w:semiHidden/>
     <w:unhideWhenUsed/>
@@ -790,11 +710,11 @@
       <w:color w:val="272727" w:themeColor="text1" w:themeTint="D8"/>
     </w:rPr>
   </w:style>
-  <w:style w:type="paragraph" w:styleId="9">
+  <w:style w:type="paragraph" w:styleId="berschrift9">
     <w:name w:val="heading 9"/>
-    <w:basedOn w:val="a"/>
-    <w:next w:val="a"/>
-    <w:link w:val="9Char"/>
+    <w:basedOn w:val="Standard"/>
+    <w:next w:val="Standard"/>
+    <w:link w:val="berschrift9Zchn"/>
     <w:uiPriority w:val="9"/>
     <w:semiHidden/>
     <w:unhideWhenUsed/>
@@ -811,13 +731,12 @@
       <w:color w:val="272727" w:themeColor="text1" w:themeTint="D8"/>
     </w:rPr>
   </w:style>
-  <w:style w:type="character" w:default="1" w:styleId="a0">
+  <w:style w:type="character" w:default="1" w:styleId="Absatz-Standardschriftart">
     <w:name w:val="Default Paragraph Font"/>
     <w:uiPriority w:val="1"/>
-    <w:semiHidden/>
     <w:unhideWhenUsed/>
   </w:style>
-  <w:style w:type="table" w:default="1" w:styleId="a1">
+  <w:style w:type="table" w:default="1" w:styleId="NormaleTabelle">
     <w:name w:val="Normal Table"/>
     <w:uiPriority w:val="99"/>
     <w:semiHidden/>
@@ -832,16 +751,16 @@
       </w:tblCellMar>
     </w:tblPr>
   </w:style>
-  <w:style w:type="numbering" w:default="1" w:styleId="a2">
+  <w:style w:type="numbering" w:default="1" w:styleId="KeineListe">
     <w:name w:val="No List"/>
     <w:uiPriority w:val="99"/>
     <w:semiHidden/>
     <w:unhideWhenUsed/>
   </w:style>
-  <w:style w:type="character" w:customStyle="1" w:styleId="1Char">
-    <w:name w:val="제목 1 Char"/>
-    <w:basedOn w:val="a0"/>
-    <w:link w:val="1"/>
+  <w:style w:type="character" w:customStyle="1" w:styleId="berschrift1Zchn">
+    <w:name w:val="Überschrift 1 Zchn"/>
+    <w:basedOn w:val="Absatz-Standardschriftart"/>
+    <w:link w:val="berschrift1"/>
     <w:uiPriority w:val="9"/>
     <w:rsid w:val="008E5513"/>
     <w:rPr>
@@ -851,10 +770,10 @@
       <w:szCs w:val="40"/>
     </w:rPr>
   </w:style>
-  <w:style w:type="character" w:customStyle="1" w:styleId="2Char">
-    <w:name w:val="제목 2 Char"/>
-    <w:basedOn w:val="a0"/>
-    <w:link w:val="2"/>
+  <w:style w:type="character" w:customStyle="1" w:styleId="berschrift2Zchn">
+    <w:name w:val="Überschrift 2 Zchn"/>
+    <w:basedOn w:val="Absatz-Standardschriftart"/>
+    <w:link w:val="berschrift2"/>
     <w:uiPriority w:val="9"/>
     <w:semiHidden/>
     <w:rsid w:val="008E5513"/>
@@ -865,10 +784,10 @@
       <w:szCs w:val="32"/>
     </w:rPr>
   </w:style>
-  <w:style w:type="character" w:customStyle="1" w:styleId="3Char">
-    <w:name w:val="제목 3 Char"/>
-    <w:basedOn w:val="a0"/>
-    <w:link w:val="3"/>
+  <w:style w:type="character" w:customStyle="1" w:styleId="berschrift3Zchn">
+    <w:name w:val="Überschrift 3 Zchn"/>
+    <w:basedOn w:val="Absatz-Standardschriftart"/>
+    <w:link w:val="berschrift3"/>
     <w:uiPriority w:val="9"/>
     <w:semiHidden/>
     <w:rsid w:val="008E5513"/>
@@ -879,10 +798,10 @@
       <w:szCs w:val="28"/>
     </w:rPr>
   </w:style>
-  <w:style w:type="character" w:customStyle="1" w:styleId="4Char">
-    <w:name w:val="제목 4 Char"/>
-    <w:basedOn w:val="a0"/>
-    <w:link w:val="4"/>
+  <w:style w:type="character" w:customStyle="1" w:styleId="berschrift4Zchn">
+    <w:name w:val="Überschrift 4 Zchn"/>
+    <w:basedOn w:val="Absatz-Standardschriftart"/>
+    <w:link w:val="berschrift4"/>
     <w:uiPriority w:val="9"/>
     <w:semiHidden/>
     <w:rsid w:val="008E5513"/>
@@ -893,10 +812,10 @@
       <w:color w:val="0F4761" w:themeColor="accent1" w:themeShade="BF"/>
     </w:rPr>
   </w:style>
-  <w:style w:type="character" w:customStyle="1" w:styleId="5Char">
-    <w:name w:val="제목 5 Char"/>
-    <w:basedOn w:val="a0"/>
-    <w:link w:val="5"/>
+  <w:style w:type="character" w:customStyle="1" w:styleId="berschrift5Zchn">
+    <w:name w:val="Überschrift 5 Zchn"/>
+    <w:basedOn w:val="Absatz-Standardschriftart"/>
+    <w:link w:val="berschrift5"/>
     <w:uiPriority w:val="9"/>
     <w:semiHidden/>
     <w:rsid w:val="008E5513"/>
@@ -905,10 +824,10 @@
       <w:color w:val="0F4761" w:themeColor="accent1" w:themeShade="BF"/>
     </w:rPr>
   </w:style>
-  <w:style w:type="character" w:customStyle="1" w:styleId="6Char">
-    <w:name w:val="제목 6 Char"/>
-    <w:basedOn w:val="a0"/>
-    <w:link w:val="6"/>
+  <w:style w:type="character" w:customStyle="1" w:styleId="berschrift6Zchn">
+    <w:name w:val="Überschrift 6 Zchn"/>
+    <w:basedOn w:val="Absatz-Standardschriftart"/>
+    <w:link w:val="berschrift6"/>
     <w:uiPriority w:val="9"/>
     <w:semiHidden/>
     <w:rsid w:val="008E5513"/>
@@ -919,10 +838,10 @@
       <w:color w:val="595959" w:themeColor="text1" w:themeTint="A6"/>
     </w:rPr>
   </w:style>
-  <w:style w:type="character" w:customStyle="1" w:styleId="7Char">
-    <w:name w:val="제목 7 Char"/>
-    <w:basedOn w:val="a0"/>
-    <w:link w:val="7"/>
+  <w:style w:type="character" w:customStyle="1" w:styleId="berschrift7Zchn">
+    <w:name w:val="Überschrift 7 Zchn"/>
+    <w:basedOn w:val="Absatz-Standardschriftart"/>
+    <w:link w:val="berschrift7"/>
     <w:uiPriority w:val="9"/>
     <w:semiHidden/>
     <w:rsid w:val="008E5513"/>
@@ -931,10 +850,10 @@
       <w:color w:val="595959" w:themeColor="text1" w:themeTint="A6"/>
     </w:rPr>
   </w:style>
-  <w:style w:type="character" w:customStyle="1" w:styleId="8Char">
-    <w:name w:val="제목 8 Char"/>
-    <w:basedOn w:val="a0"/>
-    <w:link w:val="8"/>
+  <w:style w:type="character" w:customStyle="1" w:styleId="berschrift8Zchn">
+    <w:name w:val="Überschrift 8 Zchn"/>
+    <w:basedOn w:val="Absatz-Standardschriftart"/>
+    <w:link w:val="berschrift8"/>
     <w:uiPriority w:val="9"/>
     <w:semiHidden/>
     <w:rsid w:val="008E5513"/>
@@ -945,10 +864,10 @@
       <w:color w:val="272727" w:themeColor="text1" w:themeTint="D8"/>
     </w:rPr>
   </w:style>
-  <w:style w:type="character" w:customStyle="1" w:styleId="9Char">
-    <w:name w:val="제목 9 Char"/>
-    <w:basedOn w:val="a0"/>
-    <w:link w:val="9"/>
+  <w:style w:type="character" w:customStyle="1" w:styleId="berschrift9Zchn">
+    <w:name w:val="Überschrift 9 Zchn"/>
+    <w:basedOn w:val="Absatz-Standardschriftart"/>
+    <w:link w:val="berschrift9"/>
     <w:uiPriority w:val="9"/>
     <w:semiHidden/>
     <w:rsid w:val="008E5513"/>
@@ -957,11 +876,11 @@
       <w:color w:val="272727" w:themeColor="text1" w:themeTint="D8"/>
     </w:rPr>
   </w:style>
-  <w:style w:type="paragraph" w:styleId="a3">
+  <w:style w:type="paragraph" w:styleId="Titel">
     <w:name w:val="Title"/>
-    <w:basedOn w:val="a"/>
-    <w:next w:val="a"/>
-    <w:link w:val="Char"/>
+    <w:basedOn w:val="Standard"/>
+    <w:next w:val="Standard"/>
+    <w:link w:val="TitelZchn"/>
     <w:uiPriority w:val="10"/>
     <w:qFormat/>
     <w:rsid w:val="008E5513"/>
@@ -977,10 +896,10 @@
       <w:szCs w:val="56"/>
     </w:rPr>
   </w:style>
-  <w:style w:type="character" w:customStyle="1" w:styleId="Char">
-    <w:name w:val="제목 Char"/>
-    <w:basedOn w:val="a0"/>
-    <w:link w:val="a3"/>
+  <w:style w:type="character" w:customStyle="1" w:styleId="TitelZchn">
+    <w:name w:val="Titel Zchn"/>
+    <w:basedOn w:val="Absatz-Standardschriftart"/>
+    <w:link w:val="Titel"/>
     <w:uiPriority w:val="10"/>
     <w:rsid w:val="008E5513"/>
     <w:rPr>
@@ -991,11 +910,11 @@
       <w:szCs w:val="56"/>
     </w:rPr>
   </w:style>
-  <w:style w:type="paragraph" w:styleId="a4">
+  <w:style w:type="paragraph" w:styleId="Untertitel">
     <w:name w:val="Subtitle"/>
-    <w:basedOn w:val="a"/>
-    <w:next w:val="a"/>
-    <w:link w:val="Char0"/>
+    <w:basedOn w:val="Standard"/>
+    <w:next w:val="Standard"/>
+    <w:link w:val="UntertitelZchn"/>
     <w:uiPriority w:val="11"/>
     <w:qFormat/>
     <w:rsid w:val="008E5513"/>
@@ -1012,10 +931,10 @@
       <w:szCs w:val="28"/>
     </w:rPr>
   </w:style>
-  <w:style w:type="character" w:customStyle="1" w:styleId="Char0">
-    <w:name w:val="부제 Char"/>
-    <w:basedOn w:val="a0"/>
-    <w:link w:val="a4"/>
+  <w:style w:type="character" w:customStyle="1" w:styleId="UntertitelZchn">
+    <w:name w:val="Untertitel Zchn"/>
+    <w:basedOn w:val="Absatz-Standardschriftart"/>
+    <w:link w:val="Untertitel"/>
     <w:uiPriority w:val="11"/>
     <w:rsid w:val="008E5513"/>
     <w:rPr>
@@ -1026,11 +945,11 @@
       <w:szCs w:val="28"/>
     </w:rPr>
   </w:style>
-  <w:style w:type="paragraph" w:styleId="a5">
+  <w:style w:type="paragraph" w:styleId="Zitat">
     <w:name w:val="Quote"/>
-    <w:basedOn w:val="a"/>
-    <w:next w:val="a"/>
-    <w:link w:val="Char1"/>
+    <w:basedOn w:val="Standard"/>
+    <w:next w:val="Standard"/>
+    <w:link w:val="ZitatZchn"/>
     <w:uiPriority w:val="29"/>
     <w:qFormat/>
     <w:rsid w:val="008E5513"/>
@@ -1044,10 +963,10 @@
       <w:color w:val="404040" w:themeColor="text1" w:themeTint="BF"/>
     </w:rPr>
   </w:style>
-  <w:style w:type="character" w:customStyle="1" w:styleId="Char1">
-    <w:name w:val="인용 Char"/>
-    <w:basedOn w:val="a0"/>
-    <w:link w:val="a5"/>
+  <w:style w:type="character" w:customStyle="1" w:styleId="ZitatZchn">
+    <w:name w:val="Zitat Zchn"/>
+    <w:basedOn w:val="Absatz-Standardschriftart"/>
+    <w:link w:val="Zitat"/>
     <w:uiPriority w:val="29"/>
     <w:rsid w:val="008E5513"/>
     <w:rPr>
@@ -1056,9 +975,9 @@
       <w:color w:val="404040" w:themeColor="text1" w:themeTint="BF"/>
     </w:rPr>
   </w:style>
-  <w:style w:type="paragraph" w:styleId="a6">
+  <w:style w:type="paragraph" w:styleId="Listenabsatz">
     <w:name w:val="List Paragraph"/>
-    <w:basedOn w:val="a"/>
+    <w:basedOn w:val="Standard"/>
     <w:uiPriority w:val="34"/>
     <w:qFormat/>
     <w:rsid w:val="008E5513"/>
@@ -1067,9 +986,9 @@
       <w:contextualSpacing/>
     </w:pPr>
   </w:style>
-  <w:style w:type="character" w:styleId="a7">
+  <w:style w:type="character" w:styleId="IntensiveHervorhebung">
     <w:name w:val="Intense Emphasis"/>
-    <w:basedOn w:val="a0"/>
+    <w:basedOn w:val="Absatz-Standardschriftart"/>
     <w:uiPriority w:val="21"/>
     <w:qFormat/>
     <w:rsid w:val="008E5513"/>
@@ -1079,11 +998,11 @@
       <w:color w:val="0F4761" w:themeColor="accent1" w:themeShade="BF"/>
     </w:rPr>
   </w:style>
-  <w:style w:type="paragraph" w:styleId="a8">
+  <w:style w:type="paragraph" w:styleId="IntensivesZitat">
     <w:name w:val="Intense Quote"/>
-    <w:basedOn w:val="a"/>
-    <w:next w:val="a"/>
-    <w:link w:val="Char2"/>
+    <w:basedOn w:val="Standard"/>
+    <w:next w:val="Standard"/>
+    <w:link w:val="IntensivesZitatZchn"/>
     <w:uiPriority w:val="30"/>
     <w:qFormat/>
     <w:rsid w:val="008E5513"/>
@@ -1102,10 +1021,10 @@
       <w:color w:val="0F4761" w:themeColor="accent1" w:themeShade="BF"/>
     </w:rPr>
   </w:style>
-  <w:style w:type="character" w:customStyle="1" w:styleId="Char2">
-    <w:name w:val="강한 인용 Char"/>
-    <w:basedOn w:val="a0"/>
-    <w:link w:val="a8"/>
+  <w:style w:type="character" w:customStyle="1" w:styleId="IntensivesZitatZchn">
+    <w:name w:val="Intensives Zitat Zchn"/>
+    <w:basedOn w:val="Absatz-Standardschriftart"/>
+    <w:link w:val="IntensivesZitat"/>
     <w:uiPriority w:val="30"/>
     <w:rsid w:val="008E5513"/>
     <w:rPr>
@@ -1114,9 +1033,9 @@
       <w:color w:val="0F4761" w:themeColor="accent1" w:themeShade="BF"/>
     </w:rPr>
   </w:style>
-  <w:style w:type="character" w:styleId="a9">
+  <w:style w:type="character" w:styleId="IntensiverVerweis">
     <w:name w:val="Intense Reference"/>
-    <w:basedOn w:val="a0"/>
+    <w:basedOn w:val="Absatz-Standardschriftart"/>
     <w:uiPriority w:val="32"/>
     <w:qFormat/>
     <w:rsid w:val="008E5513"/>
@@ -1127,50 +1046,6 @@
       <w:color w:val="0F4761" w:themeColor="accent1" w:themeShade="BF"/>
       <w:spacing w:val="5"/>
     </w:rPr>
-  </w:style>
-  <w:style w:type="paragraph" w:styleId="aa">
-    <w:name w:val="header"/>
-    <w:basedOn w:val="a"/>
-    <w:link w:val="Char3"/>
-    <w:uiPriority w:val="99"/>
-    <w:unhideWhenUsed/>
-    <w:rsid w:val="008F325F"/>
-    <w:pPr>
-      <w:tabs>
-        <w:tab w:val="center" w:pos="4513"/>
-        <w:tab w:val="right" w:pos="9026"/>
-      </w:tabs>
-      <w:snapToGrid w:val="0"/>
-    </w:pPr>
-  </w:style>
-  <w:style w:type="character" w:customStyle="1" w:styleId="Char3">
-    <w:name w:val="머리글 Char"/>
-    <w:basedOn w:val="a0"/>
-    <w:link w:val="aa"/>
-    <w:uiPriority w:val="99"/>
-    <w:rsid w:val="008F325F"/>
-  </w:style>
-  <w:style w:type="paragraph" w:styleId="ab">
-    <w:name w:val="footer"/>
-    <w:basedOn w:val="a"/>
-    <w:link w:val="Char4"/>
-    <w:uiPriority w:val="99"/>
-    <w:unhideWhenUsed/>
-    <w:rsid w:val="008F325F"/>
-    <w:pPr>
-      <w:tabs>
-        <w:tab w:val="center" w:pos="4513"/>
-        <w:tab w:val="right" w:pos="9026"/>
-      </w:tabs>
-      <w:snapToGrid w:val="0"/>
-    </w:pPr>
-  </w:style>
-  <w:style w:type="character" w:customStyle="1" w:styleId="Char4">
-    <w:name w:val="바닥글 Char"/>
-    <w:basedOn w:val="a0"/>
-    <w:link w:val="ab"/>
-    <w:uiPriority w:val="99"/>
-    <w:rsid w:val="008F325F"/>
   </w:style>
 </w:styles>
 </file>

</xml_diff>